<commit_message>
feat: add rejection reason for berita acara, pdf-render libs, and download menu
</commit_message>
<xml_diff>
--- a/file/Lembar kendali sampel.docx
+++ b/file/Lembar kendali sampel.docx
@@ -523,7 +523,7 @@
         <w:rPr>
           <w:rFonts w:ascii="Calibri" w:eastAsia="Calibri" w:hAnsi="Calibri" w:cs="Calibri"/>
         </w:rPr>
-        <w:t>Asal Sampel</w:t>
+        <w:t xml:space="preserve">Asal Sampel: &lt;&lt;agenda&gt;&gt;</w:t>
       </w:r>
       <w:r>
         <w:rPr>
@@ -536,14 +536,14 @@
           <w:rFonts w:ascii="Calibri" w:eastAsia="Calibri" w:hAnsi="Calibri" w:cs="Calibri"/>
         </w:rPr>
         <w:tab/>
-        <w:t xml:space="preserve">: </w:t>
+        <w:t xml:space="preserve"/>
       </w:r>
       <w:r>
         <w:rPr>
           <w:rFonts w:ascii="Calibri" w:eastAsia="Calibri" w:hAnsi="Calibri" w:cs="Calibri"/>
           <w:u w:val="single"/>
         </w:rPr>
-        <w:t>&lt;&lt;</w:t>
+        <w:t xml:space="preserve"/>
       </w:r>
       <w:r>
         <w:rPr>
@@ -553,7 +553,7 @@
           <w:highlight w:val="white"/>
           <w:u w:val="single"/>
         </w:rPr>
-        <w:t>Agenda&gt;&gt;</w:t>
+        <w:t xml:space="preserve"/>
       </w:r>
     </w:p>
     <w:p>
@@ -1974,6 +1974,12 @@
                 <w:rFonts w:ascii="Calibri" w:eastAsia="Calibri" w:hAnsi="Calibri" w:cs="Calibri"/>
               </w:rPr>
             </w:pPr>
+            <w:r>
+              <w:rPr>
+                <w:rFonts w:ascii="Calibri" w:eastAsia="Calibri" w:hAnsi="Calibri" w:cs="Calibri"/>
+              </w:rPr>
+              <w:t xml:space="preserve">&lt;&lt;pengukuran_pengulangan_per_sampel&gt;&gt;</w:t>
+            </w:r>
           </w:p>
         </w:tc>
         <w:tc>

</xml_diff>